<commit_message>
Wrote more on the Final Project Reflection
</commit_message>
<xml_diff>
--- a/CSI-160 Final Project Reflection.docx
+++ b/CSI-160 Final Project Reflection.docx
@@ -1,225 +1,182 @@
 
 <file path=word/document.xml><?xml version="1.0" encoding="utf-8"?>
-<w:document xmlns:o="urn:schemas-microsoft-com:office:office" xmlns:r="http://schemas.openxmlformats.org/officeDocument/2006/relationships" xmlns:v="urn:schemas-microsoft-com:vml" xmlns:w="http://schemas.openxmlformats.org/wordprocessingml/2006/main" xmlns:w10="urn:schemas-microsoft-com:office:word" xmlns:wp="http://schemas.openxmlformats.org/drawingml/2006/wordprocessingDrawing" xmlns:wps="http://schemas.microsoft.com/office/word/2010/wordprocessingShape" xmlns:wpg="http://schemas.microsoft.com/office/word/2010/wordprocessingGroup" xmlns:mc="http://schemas.openxmlformats.org/markup-compatibility/2006" xmlns:wp14="http://schemas.microsoft.com/office/word/2010/wordprocessingDrawing" xmlns:w14="http://schemas.microsoft.com/office/word/2010/wordml" mc:Ignorable="w14 wp14">
+<w:document xmlns:wpc="http://schemas.microsoft.com/office/word/2010/wordprocessingCanvas" xmlns:cx="http://schemas.microsoft.com/office/drawing/2014/chartex" xmlns:cx1="http://schemas.microsoft.com/office/drawing/2015/9/8/chartex" xmlns:cx2="http://schemas.microsoft.com/office/drawing/2015/10/21/chartex" xmlns:cx3="http://schemas.microsoft.com/office/drawing/2016/5/9/chartex" xmlns:cx4="http://schemas.microsoft.com/office/drawing/2016/5/10/chartex" xmlns:cx5="http://schemas.microsoft.com/office/drawing/2016/5/11/chartex" xmlns:cx6="http://schemas.microsoft.com/office/drawing/2016/5/12/chartex" xmlns:cx7="http://schemas.microsoft.com/office/drawing/2016/5/13/chartex" xmlns:cx8="http://schemas.microsoft.com/office/drawing/2016/5/14/chartex" xmlns:mc="http://schemas.openxmlformats.org/markup-compatibility/2006" xmlns:aink="http://schemas.microsoft.com/office/drawing/2016/ink" xmlns:am3d="http://schemas.microsoft.com/office/drawing/2017/model3d" xmlns:o="urn:schemas-microsoft-com:office:office" xmlns:r="http://schemas.openxmlformats.org/officeDocument/2006/relationships" xmlns:m="http://schemas.openxmlformats.org/officeDocument/2006/math" xmlns:v="urn:schemas-microsoft-com:vml" xmlns:wp14="http://schemas.microsoft.com/office/word/2010/wordprocessingDrawing" xmlns:wp="http://schemas.openxmlformats.org/drawingml/2006/wordprocessingDrawing" xmlns:w10="urn:schemas-microsoft-com:office:word" xmlns:w="http://schemas.openxmlformats.org/wordprocessingml/2006/main" xmlns:w14="http://schemas.microsoft.com/office/word/2010/wordml" xmlns:w15="http://schemas.microsoft.com/office/word/2012/wordml" xmlns:w16cex="http://schemas.microsoft.com/office/word/2018/wordml/cex" xmlns:w16cid="http://schemas.microsoft.com/office/word/2016/wordml/cid" xmlns:w16="http://schemas.microsoft.com/office/word/2018/wordml" xmlns:w16sdtdh="http://schemas.microsoft.com/office/word/2020/wordml/sdtdatahash" xmlns:w16se="http://schemas.microsoft.com/office/word/2015/wordml/symex" xmlns:wpg="http://schemas.microsoft.com/office/word/2010/wordprocessingGroup" xmlns:wpi="http://schemas.microsoft.com/office/word/2010/wordprocessingInk" xmlns:wne="http://schemas.microsoft.com/office/word/2006/wordml" xmlns:wps="http://schemas.microsoft.com/office/word/2010/wordprocessingShape" mc:Ignorable="w14 w15 w16se w16cid w16 w16cex w16sdtdh wp14">
   <w:body>
     <w:p>
       <w:pPr>
         <w:pStyle w:val="Title"/>
         <w:jc w:val="center"/>
-        <w:rPr/>
       </w:pPr>
       <w:r>
-        <w:rPr/>
         <w:t>Final Project Reflection Form</w:t>
       </w:r>
     </w:p>
-    <w:p>
-      <w:pPr>
-        <w:pStyle w:val="Normal"/>
-        <w:rPr/>
-      </w:pPr>
-      <w:r>
-        <w:rPr/>
-      </w:r>
-    </w:p>
+    <w:p/>
     <w:p>
       <w:pPr>
         <w:pStyle w:val="Heading1"/>
-        <w:rPr/>
       </w:pPr>
       <w:r>
-        <w:rPr/>
         <w:t xml:space="preserve">What did you learn or improve your skills at doing because of this project?  </w:t>
       </w:r>
     </w:p>
+    <w:p/>
     <w:p>
-      <w:pPr>
-        <w:pStyle w:val="Normal"/>
-        <w:rPr/>
-      </w:pPr>
-      <w:r>
-        <w:rPr/>
+      <w:r>
+        <w:t xml:space="preserve">This project made me learn a ton about file formatting as well get a lot better at learning to read badly written documentation. The </w:t>
+      </w:r>
+      <w:r>
+        <w:t>hardest part to wrap my head around was just figuring out every function I needed.</w:t>
       </w:r>
     </w:p>
-    <w:p>
-      <w:pPr>
-        <w:pStyle w:val="Normal"/>
-        <w:rPr/>
-      </w:pPr>
-      <w:r>
-        <w:rPr/>
-        <w:t>This project made me learn a ton about file formatting as well get a lot better at learning to read badly written documentation. The hardest part to wrap my head around was just figuring out every function I needed.</w:t>
-      </w:r>
-    </w:p>
-    <w:p>
-      <w:pPr>
-        <w:pStyle w:val="Normal"/>
-        <w:rPr/>
-      </w:pPr>
-      <w:r>
-        <w:rPr/>
-      </w:r>
-      <w:bookmarkStart w:id="0" w:name="_GoBack"/>
-      <w:bookmarkStart w:id="1" w:name="_GoBack"/>
-      <w:bookmarkEnd w:id="1"/>
-    </w:p>
-    <w:p>
-      <w:pPr>
-        <w:pStyle w:val="Normal"/>
-        <w:rPr/>
-      </w:pPr>
-      <w:r>
-        <w:rPr/>
-      </w:r>
-    </w:p>
-    <w:p>
-      <w:pPr>
-        <w:pStyle w:val="Normal"/>
-        <w:rPr/>
-      </w:pPr>
-      <w:r>
-        <w:rPr/>
-      </w:r>
-    </w:p>
-    <w:p>
-      <w:pPr>
-        <w:pStyle w:val="Normal"/>
-        <w:rPr/>
-      </w:pPr>
-      <w:r>
-        <w:rPr/>
-      </w:r>
-    </w:p>
+    <w:p/>
     <w:p>
       <w:pPr>
         <w:pStyle w:val="Heading1"/>
-        <w:rPr/>
       </w:pPr>
       <w:r>
-        <w:rPr/>
-        <w:t xml:space="preserve"> </w:t>
-      </w:r>
-      <w:r>
-        <w:rPr/>
-        <w:t>What did you try to do that didn’t work?  What did you do to get around this problem?</w:t>
+        <w:t xml:space="preserve"> What did you try to do that didn’t work?  What did you do to get around this problem?</w:t>
       </w:r>
     </w:p>
+    <w:p/>
     <w:p>
-      <w:pPr>
-        <w:pStyle w:val="Normal"/>
-        <w:rPr/>
-      </w:pPr>
-      <w:r>
-        <w:rPr/>
+      <w:r>
+        <w:t xml:space="preserve">I tried to make a queue systems on the bot side for messages and I figured out I </w:t>
+      </w:r>
+      <w:r>
+        <w:t>would have to rework the whole coding to get that done so I have left that for a thing I need to do during winter break</w:t>
+      </w:r>
+      <w:r>
+        <w:t xml:space="preserve"> (EDIT 12/5/2021 I have updated the bot to </w:t>
+      </w:r>
+      <w:proofErr w:type="gramStart"/>
+      <w:r>
+        <w:t>have  a</w:t>
+      </w:r>
+      <w:proofErr w:type="gramEnd"/>
+      <w:r>
+        <w:t xml:space="preserve"> better format and this was a lot easier than I thought it was going to be. The reason for this is because I help Abijah with his project and learned the ins and out of this other format so using it myself was </w:t>
+      </w:r>
+      <w:proofErr w:type="gramStart"/>
+      <w:r>
+        <w:t>pretty easy</w:t>
+      </w:r>
+      <w:proofErr w:type="gramEnd"/>
+      <w:r>
+        <w:t>)</w:t>
+      </w:r>
+      <w:r>
+        <w:t xml:space="preserve">. The other hardest thing was figuring out </w:t>
+      </w:r>
+      <w:proofErr w:type="spellStart"/>
+      <w:r>
+        <w:t>plexapi</w:t>
+      </w:r>
+      <w:proofErr w:type="spellEnd"/>
+      <w:r>
+        <w:t xml:space="preserve"> the way I solved my problems with it was I just started testing on another .</w:t>
+      </w:r>
+      <w:proofErr w:type="spellStart"/>
+      <w:r>
+        <w:t>py</w:t>
+      </w:r>
+      <w:proofErr w:type="spellEnd"/>
+      <w:r>
+        <w:t xml:space="preserve"> file an</w:t>
+      </w:r>
+      <w:r>
+        <w:t xml:space="preserve">d would print every variable I had come </w:t>
+      </w:r>
+      <w:proofErr w:type="gramStart"/>
+      <w:r>
+        <w:t>through</w:t>
+      </w:r>
+      <w:proofErr w:type="gramEnd"/>
+      <w:r>
+        <w:t xml:space="preserve"> so I knew exactly what was happening</w:t>
+      </w:r>
+      <w:r>
+        <w:t xml:space="preserve">. </w:t>
       </w:r>
     </w:p>
-    <w:p>
-      <w:pPr>
-        <w:pStyle w:val="Normal"/>
-        <w:rPr/>
-      </w:pPr>
-      <w:r>
-        <w:rPr/>
-        <w:t>I tried to make a queue systems on the bot side for messages and I figured out I would have to rework the whole coding to get that done so I have left that for a thing I need to do during winter break. The other hardest thing was figuring out plexapi the way I solved my problems with it was I just started testing on another .py file and would print every variable I had come through so I knew exactly what was happening</w:t>
-      </w:r>
-    </w:p>
-    <w:p>
-      <w:pPr>
-        <w:pStyle w:val="Normal"/>
-        <w:rPr/>
-      </w:pPr>
-      <w:r>
-        <w:rPr/>
-      </w:r>
-    </w:p>
-    <w:p>
-      <w:pPr>
-        <w:pStyle w:val="Normal"/>
-        <w:rPr/>
-      </w:pPr>
-      <w:r>
-        <w:rPr/>
-      </w:r>
-    </w:p>
-    <w:p>
-      <w:pPr>
-        <w:pStyle w:val="Normal"/>
-        <w:rPr/>
-      </w:pPr>
-      <w:r>
-        <w:rPr/>
-      </w:r>
-    </w:p>
-    <w:p>
-      <w:pPr>
-        <w:pStyle w:val="Normal"/>
-        <w:rPr/>
-      </w:pPr>
-      <w:r>
-        <w:rPr/>
-      </w:r>
-    </w:p>
+    <w:p/>
+    <w:p/>
     <w:p>
       <w:pPr>
         <w:pStyle w:val="Heading1"/>
-        <w:rPr/>
       </w:pPr>
       <w:r>
-        <w:rPr/>
+        <w:t xml:space="preserve"> If you did this project again, how would you approach it differently?</w:t>
+      </w:r>
+    </w:p>
+    <w:p/>
+    <w:p>
+      <w:r>
+        <w:t>I would 100% have gone at the bot side completely different I would have made it a better forma</w:t>
+      </w:r>
+      <w:r>
+        <w:t>t so a queue could easily be put in place.</w:t>
+      </w:r>
+      <w:r>
         <w:t xml:space="preserve"> </w:t>
       </w:r>
       <w:r>
-        <w:rPr/>
-        <w:t>If you did this project again, how would you approach it differently?</w:t>
-      </w:r>
-    </w:p>
-    <w:p>
-      <w:pPr>
-        <w:pStyle w:val="Normal"/>
-        <w:rPr/>
-      </w:pPr>
-      <w:r>
-        <w:rPr/>
-      </w:r>
-    </w:p>
-    <w:p>
-      <w:pPr>
-        <w:pStyle w:val="Normal"/>
-        <w:spacing w:before="0" w:after="160"/>
-        <w:rPr/>
-      </w:pPr>
-      <w:r>
-        <w:rPr/>
-        <w:t>I would 100% have gone at the bot side completely different I would have made it a better format so a queue could easily be put in place.</w:t>
+        <w:t xml:space="preserve">(EDIT </w:t>
+      </w:r>
+      <w:r>
+        <w:t xml:space="preserve">12/5/2021 as of today I just redid the whole bot side of things and now I </w:t>
+      </w:r>
+      <w:proofErr w:type="gramStart"/>
+      <w:r>
+        <w:t>have to</w:t>
+      </w:r>
+      <w:proofErr w:type="gramEnd"/>
+      <w:r>
+        <w:t xml:space="preserve"> figure out how to do the queue</w:t>
+      </w:r>
+      <w:r>
+        <w:t>)</w:t>
+      </w:r>
+      <w:r>
+        <w:t xml:space="preserve">. If I redid the </w:t>
+      </w:r>
+      <w:proofErr w:type="gramStart"/>
+      <w:r>
+        <w:t>project</w:t>
+      </w:r>
+      <w:proofErr w:type="gramEnd"/>
+      <w:r>
+        <w:t xml:space="preserve"> I would have done this differently by making the plex_scripts.py different files so it wasn’t such a large file.</w:t>
       </w:r>
     </w:p>
     <w:sectPr>
-      <w:type w:val="nextPage"/>
       <w:pgSz w:w="12240" w:h="15840"/>
-      <w:pgMar w:left="1440" w:right="1440" w:header="0" w:top="1440" w:footer="0" w:bottom="1440" w:gutter="0"/>
-      <w:pgNumType w:fmt="decimal"/>
-      <w:formProt w:val="false"/>
-      <w:textDirection w:val="lrTb"/>
-      <w:docGrid w:type="default" w:linePitch="360" w:charSpace="4096"/>
+      <w:pgMar w:top="1440" w:right="1440" w:bottom="1440" w:left="1440" w:header="0" w:footer="0" w:gutter="0"/>
+      <w:cols w:space="720"/>
+      <w:formProt w:val="0"/>
+      <w:docGrid w:linePitch="360" w:charSpace="4096"/>
     </w:sectPr>
   </w:body>
 </w:document>
 </file>
 
 <file path=word/numbering.xml><?xml version="1.0" encoding="utf-8"?>
-<w:numbering xmlns:w="http://schemas.openxmlformats.org/wordprocessingml/2006/main" xmlns:o="urn:schemas-microsoft-com:office:office" xmlns:r="http://schemas.openxmlformats.org/officeDocument/2006/relationships" xmlns:v="urn:schemas-microsoft-com:vml" xmlns:mc="http://schemas.openxmlformats.org/markup-compatibility/2006" xmlns:w14="http://schemas.microsoft.com/office/word/2010/wordml" mc:Ignorable="w14">
-  <w:abstractNum w:abstractNumId="1">
+<w:numbering xmlns:wpc="http://schemas.microsoft.com/office/word/2010/wordprocessingCanvas" xmlns:cx="http://schemas.microsoft.com/office/drawing/2014/chartex" xmlns:cx1="http://schemas.microsoft.com/office/drawing/2015/9/8/chartex" xmlns:cx2="http://schemas.microsoft.com/office/drawing/2015/10/21/chartex" xmlns:cx3="http://schemas.microsoft.com/office/drawing/2016/5/9/chartex" xmlns:cx4="http://schemas.microsoft.com/office/drawing/2016/5/10/chartex" xmlns:cx5="http://schemas.microsoft.com/office/drawing/2016/5/11/chartex" xmlns:cx6="http://schemas.microsoft.com/office/drawing/2016/5/12/chartex" xmlns:cx7="http://schemas.microsoft.com/office/drawing/2016/5/13/chartex" xmlns:cx8="http://schemas.microsoft.com/office/drawing/2016/5/14/chartex" xmlns:mc="http://schemas.openxmlformats.org/markup-compatibility/2006" xmlns:aink="http://schemas.microsoft.com/office/drawing/2016/ink" xmlns:am3d="http://schemas.microsoft.com/office/drawing/2017/model3d" xmlns:o="urn:schemas-microsoft-com:office:office" xmlns:r="http://schemas.openxmlformats.org/officeDocument/2006/relationships" xmlns:m="http://schemas.openxmlformats.org/officeDocument/2006/math" xmlns:v="urn:schemas-microsoft-com:vml" xmlns:wp14="http://schemas.microsoft.com/office/word/2010/wordprocessingDrawing" xmlns:wp="http://schemas.openxmlformats.org/drawingml/2006/wordprocessingDrawing" xmlns:w10="urn:schemas-microsoft-com:office:word" xmlns:w="http://schemas.openxmlformats.org/wordprocessingml/2006/main" xmlns:w14="http://schemas.microsoft.com/office/word/2010/wordml" xmlns:w15="http://schemas.microsoft.com/office/word/2012/wordml" xmlns:w16cex="http://schemas.microsoft.com/office/word/2018/wordml/cex" xmlns:w16cid="http://schemas.microsoft.com/office/word/2016/wordml/cid" xmlns:w16="http://schemas.microsoft.com/office/word/2018/wordml" xmlns:w16sdtdh="http://schemas.microsoft.com/office/word/2020/wordml/sdtdatahash" xmlns:w16se="http://schemas.microsoft.com/office/word/2015/wordml/symex" xmlns:wpg="http://schemas.microsoft.com/office/word/2010/wordprocessingGroup" xmlns:wpi="http://schemas.microsoft.com/office/word/2010/wordprocessingInk" xmlns:wne="http://schemas.microsoft.com/office/word/2006/wordml" xmlns:wps="http://schemas.microsoft.com/office/word/2010/wordprocessingShape" mc:Ignorable="w14 w15 w16se w16cid w16 w16cex w16sdtdh wp14">
+  <w:abstractNum w:abstractNumId="0" w15:restartNumberingAfterBreak="0">
+    <w:nsid w:val="25EC1306"/>
+    <w:multiLevelType w:val="multilevel"/>
+    <w:tmpl w:val="E1226412"/>
     <w:lvl w:ilvl="0">
       <w:start w:val="1"/>
+      <w:numFmt w:val="upperRoman"/>
       <w:pStyle w:val="Heading1"/>
-      <w:numFmt w:val="upperRoman"/>
       <w:lvlText w:val="%1."/>
       <w:lvlJc w:val="left"/>
       <w:pPr>
         <w:tabs>
           <w:tab w:val="num" w:pos="0"/>
         </w:tabs>
-        <w:ind w:left="0" w:hanging="0"/>
+        <w:ind w:left="0" w:firstLine="0"/>
       </w:pPr>
       <w:rPr>
         <w:sz w:val="32"/>
@@ -228,121 +185,121 @@
     </w:lvl>
     <w:lvl w:ilvl="1">
       <w:start w:val="1"/>
+      <w:numFmt w:val="upperLetter"/>
       <w:pStyle w:val="Heading2"/>
-      <w:numFmt w:val="upperLetter"/>
       <w:lvlText w:val="%2."/>
       <w:lvlJc w:val="left"/>
       <w:pPr>
         <w:tabs>
           <w:tab w:val="num" w:pos="0"/>
         </w:tabs>
-        <w:ind w:left="720" w:hanging="0"/>
+        <w:ind w:left="720" w:firstLine="0"/>
       </w:pPr>
     </w:lvl>
     <w:lvl w:ilvl="2">
       <w:start w:val="1"/>
+      <w:numFmt w:val="decimal"/>
       <w:pStyle w:val="Heading3"/>
-      <w:numFmt w:val="decimal"/>
       <w:lvlText w:val="%3."/>
       <w:lvlJc w:val="left"/>
       <w:pPr>
         <w:tabs>
           <w:tab w:val="num" w:pos="0"/>
         </w:tabs>
-        <w:ind w:left="1440" w:hanging="0"/>
+        <w:ind w:left="1440" w:firstLine="0"/>
       </w:pPr>
     </w:lvl>
     <w:lvl w:ilvl="3">
       <w:start w:val="1"/>
+      <w:numFmt w:val="lowerLetter"/>
       <w:pStyle w:val="Heading4"/>
-      <w:numFmt w:val="lowerLetter"/>
       <w:lvlText w:val="%4)"/>
       <w:lvlJc w:val="left"/>
       <w:pPr>
         <w:tabs>
           <w:tab w:val="num" w:pos="0"/>
         </w:tabs>
-        <w:ind w:left="2160" w:hanging="0"/>
+        <w:ind w:left="2160" w:firstLine="0"/>
       </w:pPr>
     </w:lvl>
     <w:lvl w:ilvl="4">
       <w:start w:val="1"/>
+      <w:numFmt w:val="decimal"/>
       <w:pStyle w:val="Heading5"/>
-      <w:numFmt w:val="decimal"/>
       <w:lvlText w:val="(%5)"/>
       <w:lvlJc w:val="left"/>
       <w:pPr>
         <w:tabs>
           <w:tab w:val="num" w:pos="0"/>
         </w:tabs>
-        <w:ind w:left="2880" w:hanging="0"/>
+        <w:ind w:left="2880" w:firstLine="0"/>
       </w:pPr>
     </w:lvl>
     <w:lvl w:ilvl="5">
       <w:start w:val="1"/>
+      <w:numFmt w:val="lowerLetter"/>
       <w:pStyle w:val="Heading6"/>
-      <w:numFmt w:val="lowerLetter"/>
       <w:lvlText w:val="(%6)"/>
       <w:lvlJc w:val="left"/>
       <w:pPr>
         <w:tabs>
           <w:tab w:val="num" w:pos="0"/>
         </w:tabs>
-        <w:ind w:left="3600" w:hanging="0"/>
+        <w:ind w:left="3600" w:firstLine="0"/>
       </w:pPr>
     </w:lvl>
     <w:lvl w:ilvl="6">
       <w:start w:val="1"/>
+      <w:numFmt w:val="lowerRoman"/>
       <w:pStyle w:val="Heading7"/>
-      <w:numFmt w:val="lowerRoman"/>
       <w:lvlText w:val="(%7)"/>
       <w:lvlJc w:val="left"/>
       <w:pPr>
         <w:tabs>
           <w:tab w:val="num" w:pos="0"/>
         </w:tabs>
-        <w:ind w:left="4320" w:hanging="0"/>
+        <w:ind w:left="4320" w:firstLine="0"/>
       </w:pPr>
     </w:lvl>
     <w:lvl w:ilvl="7">
       <w:start w:val="1"/>
+      <w:numFmt w:val="lowerLetter"/>
       <w:pStyle w:val="Heading8"/>
-      <w:numFmt w:val="lowerLetter"/>
       <w:lvlText w:val="(%8)"/>
       <w:lvlJc w:val="left"/>
       <w:pPr>
         <w:tabs>
           <w:tab w:val="num" w:pos="0"/>
         </w:tabs>
-        <w:ind w:left="5040" w:hanging="0"/>
+        <w:ind w:left="5040" w:firstLine="0"/>
       </w:pPr>
     </w:lvl>
     <w:lvl w:ilvl="8">
       <w:start w:val="1"/>
+      <w:numFmt w:val="lowerRoman"/>
       <w:pStyle w:val="Heading9"/>
-      <w:numFmt w:val="lowerRoman"/>
       <w:lvlText w:val="(%9)"/>
       <w:lvlJc w:val="left"/>
       <w:pPr>
         <w:tabs>
           <w:tab w:val="num" w:pos="0"/>
         </w:tabs>
-        <w:ind w:left="5760" w:hanging="0"/>
+        <w:ind w:left="5760" w:firstLine="0"/>
       </w:pPr>
     </w:lvl>
   </w:abstractNum>
   <w:num w:numId="1">
-    <w:abstractNumId w:val="1"/>
+    <w:abstractNumId w:val="0"/>
   </w:num>
 </w:numbering>
 </file>
 
 <file path=word/styles.xml><?xml version="1.0" encoding="utf-8"?>
-<w:styles xmlns:w="http://schemas.openxmlformats.org/wordprocessingml/2006/main" xmlns:w14="http://schemas.microsoft.com/office/word/2010/wordml" xmlns:mc="http://schemas.openxmlformats.org/markup-compatibility/2006" mc:Ignorable="w14">
+<w:styles xmlns:mc="http://schemas.openxmlformats.org/markup-compatibility/2006" xmlns:r="http://schemas.openxmlformats.org/officeDocument/2006/relationships" xmlns:w="http://schemas.openxmlformats.org/wordprocessingml/2006/main" xmlns:w14="http://schemas.microsoft.com/office/word/2010/wordml" xmlns:w15="http://schemas.microsoft.com/office/word/2012/wordml" xmlns:w16cex="http://schemas.microsoft.com/office/word/2018/wordml/cex" xmlns:w16cid="http://schemas.microsoft.com/office/word/2016/wordml/cid" xmlns:w16="http://schemas.microsoft.com/office/word/2018/wordml" xmlns:w16sdtdh="http://schemas.microsoft.com/office/word/2020/wordml/sdtdatahash" xmlns:w16se="http://schemas.microsoft.com/office/word/2015/wordml/symex" mc:Ignorable="w14 w15 w16se w16cid w16 w16cex w16sdtdh">
   <w:docDefaults>
     <w:rPrDefault>
       <w:rPr>
-        <w:rFonts w:ascii="Calibri" w:hAnsi="Calibri" w:eastAsia="Calibri" w:cs="" w:asciiTheme="minorHAnsi" w:cstheme="minorBidi" w:eastAsiaTheme="minorHAnsi" w:hAnsiTheme="minorHAnsi"/>
+        <w:rFonts w:asciiTheme="minorHAnsi" w:eastAsiaTheme="minorHAnsi" w:hAnsiTheme="minorHAnsi" w:cstheme="minorBidi"/>
         <w:sz w:val="22"/>
         <w:szCs w:val="22"/>
         <w:lang w:val="en-US" w:eastAsia="en-US" w:bidi="ar-SA"/>
@@ -350,21 +307,21 @@
     </w:rPrDefault>
     <w:pPrDefault>
       <w:pPr>
-        <w:suppressAutoHyphens w:val="true"/>
+        <w:suppressAutoHyphens/>
       </w:pPr>
     </w:pPrDefault>
   </w:docDefaults>
-  <w:latentStyles w:defLockedState="0" w:defUIPriority="99" w:defSemiHidden="0" w:defUnhideWhenUsed="0" w:defQFormat="0" w:count="382">
+  <w:latentStyles w:defLockedState="0" w:defUIPriority="99" w:defSemiHidden="0" w:defUnhideWhenUsed="0" w:defQFormat="0" w:count="376">
     <w:lsdException w:name="Normal" w:uiPriority="0" w:qFormat="1"/>
     <w:lsdException w:name="heading 1" w:uiPriority="9" w:qFormat="1"/>
-    <w:lsdException w:name="heading 2" w:uiPriority="9" w:semiHidden="1" w:unhideWhenUsed="1" w:qFormat="1"/>
-    <w:lsdException w:name="heading 3" w:uiPriority="9" w:semiHidden="1" w:unhideWhenUsed="1" w:qFormat="1"/>
-    <w:lsdException w:name="heading 4" w:uiPriority="9" w:semiHidden="1" w:unhideWhenUsed="1" w:qFormat="1"/>
-    <w:lsdException w:name="heading 5" w:uiPriority="9" w:semiHidden="1" w:unhideWhenUsed="1" w:qFormat="1"/>
-    <w:lsdException w:name="heading 6" w:uiPriority="9" w:semiHidden="1" w:unhideWhenUsed="1" w:qFormat="1"/>
-    <w:lsdException w:name="heading 7" w:uiPriority="9" w:semiHidden="1" w:unhideWhenUsed="1" w:qFormat="1"/>
-    <w:lsdException w:name="heading 8" w:uiPriority="9" w:semiHidden="1" w:unhideWhenUsed="1" w:qFormat="1"/>
-    <w:lsdException w:name="heading 9" w:uiPriority="9" w:semiHidden="1" w:unhideWhenUsed="1" w:qFormat="1"/>
+    <w:lsdException w:name="heading 2" w:semiHidden="1" w:uiPriority="9" w:unhideWhenUsed="1" w:qFormat="1"/>
+    <w:lsdException w:name="heading 3" w:semiHidden="1" w:uiPriority="9" w:unhideWhenUsed="1" w:qFormat="1"/>
+    <w:lsdException w:name="heading 4" w:semiHidden="1" w:uiPriority="9" w:unhideWhenUsed="1" w:qFormat="1"/>
+    <w:lsdException w:name="heading 5" w:semiHidden="1" w:uiPriority="9" w:unhideWhenUsed="1" w:qFormat="1"/>
+    <w:lsdException w:name="heading 6" w:semiHidden="1" w:uiPriority="9" w:unhideWhenUsed="1" w:qFormat="1"/>
+    <w:lsdException w:name="heading 7" w:semiHidden="1" w:uiPriority="9" w:unhideWhenUsed="1" w:qFormat="1"/>
+    <w:lsdException w:name="heading 8" w:semiHidden="1" w:uiPriority="9" w:unhideWhenUsed="1" w:qFormat="1"/>
+    <w:lsdException w:name="heading 9" w:semiHidden="1" w:uiPriority="9" w:unhideWhenUsed="1" w:qFormat="1"/>
     <w:lsdException w:name="index 1" w:semiHidden="1" w:unhideWhenUsed="1"/>
     <w:lsdException w:name="index 2" w:semiHidden="1" w:unhideWhenUsed="1"/>
     <w:lsdException w:name="index 3" w:semiHidden="1" w:unhideWhenUsed="1"/>
@@ -374,22 +331,22 @@
     <w:lsdException w:name="index 7" w:semiHidden="1" w:unhideWhenUsed="1"/>
     <w:lsdException w:name="index 8" w:semiHidden="1" w:unhideWhenUsed="1"/>
     <w:lsdException w:name="index 9" w:semiHidden="1" w:unhideWhenUsed="1"/>
-    <w:lsdException w:name="toc 1" w:uiPriority="39" w:semiHidden="1" w:unhideWhenUsed="1"/>
-    <w:lsdException w:name="toc 2" w:uiPriority="39" w:semiHidden="1" w:unhideWhenUsed="1"/>
-    <w:lsdException w:name="toc 3" w:uiPriority="39" w:semiHidden="1" w:unhideWhenUsed="1"/>
-    <w:lsdException w:name="toc 4" w:uiPriority="39" w:semiHidden="1" w:unhideWhenUsed="1"/>
-    <w:lsdException w:name="toc 5" w:uiPriority="39" w:semiHidden="1" w:unhideWhenUsed="1"/>
-    <w:lsdException w:name="toc 6" w:uiPriority="39" w:semiHidden="1" w:unhideWhenUsed="1"/>
-    <w:lsdException w:name="toc 7" w:uiPriority="39" w:semiHidden="1" w:unhideWhenUsed="1"/>
-    <w:lsdException w:name="toc 8" w:uiPriority="39" w:semiHidden="1" w:unhideWhenUsed="1"/>
-    <w:lsdException w:name="toc 9" w:uiPriority="39" w:semiHidden="1" w:unhideWhenUsed="1"/>
+    <w:lsdException w:name="toc 1" w:semiHidden="1" w:uiPriority="39" w:unhideWhenUsed="1"/>
+    <w:lsdException w:name="toc 2" w:semiHidden="1" w:uiPriority="39" w:unhideWhenUsed="1"/>
+    <w:lsdException w:name="toc 3" w:semiHidden="1" w:uiPriority="39" w:unhideWhenUsed="1"/>
+    <w:lsdException w:name="toc 4" w:semiHidden="1" w:uiPriority="39" w:unhideWhenUsed="1"/>
+    <w:lsdException w:name="toc 5" w:semiHidden="1" w:uiPriority="39" w:unhideWhenUsed="1"/>
+    <w:lsdException w:name="toc 6" w:semiHidden="1" w:uiPriority="39" w:unhideWhenUsed="1"/>
+    <w:lsdException w:name="toc 7" w:semiHidden="1" w:uiPriority="39" w:unhideWhenUsed="1"/>
+    <w:lsdException w:name="toc 8" w:semiHidden="1" w:uiPriority="39" w:unhideWhenUsed="1"/>
+    <w:lsdException w:name="toc 9" w:semiHidden="1" w:uiPriority="39" w:unhideWhenUsed="1"/>
     <w:lsdException w:name="Normal Indent" w:semiHidden="1" w:unhideWhenUsed="1"/>
     <w:lsdException w:name="footnote text" w:semiHidden="1" w:unhideWhenUsed="1"/>
     <w:lsdException w:name="annotation text" w:semiHidden="1" w:unhideWhenUsed="1"/>
     <w:lsdException w:name="header" w:semiHidden="1" w:unhideWhenUsed="1"/>
     <w:lsdException w:name="footer" w:semiHidden="1" w:unhideWhenUsed="1"/>
     <w:lsdException w:name="index heading" w:semiHidden="1" w:unhideWhenUsed="1"/>
-    <w:lsdException w:name="caption" w:uiPriority="35" w:semiHidden="1" w:unhideWhenUsed="1" w:qFormat="1"/>
+    <w:lsdException w:name="caption" w:semiHidden="1" w:uiPriority="35" w:unhideWhenUsed="1" w:qFormat="1"/>
     <w:lsdException w:name="table of figures" w:semiHidden="1" w:unhideWhenUsed="1"/>
     <w:lsdException w:name="envelope address" w:semiHidden="1" w:unhideWhenUsed="1"/>
     <w:lsdException w:name="envelope return" w:semiHidden="1" w:unhideWhenUsed="1"/>
@@ -420,7 +377,7 @@
     <w:lsdException w:name="Title" w:uiPriority="10" w:qFormat="1"/>
     <w:lsdException w:name="Closing" w:semiHidden="1" w:unhideWhenUsed="1"/>
     <w:lsdException w:name="Signature" w:semiHidden="1" w:unhideWhenUsed="1"/>
-    <w:lsdException w:name="Default Paragraph Font" w:uiPriority="1" w:semiHidden="1" w:unhideWhenUsed="1"/>
+    <w:lsdException w:name="Default Paragraph Font" w:semiHidden="1" w:uiPriority="1" w:unhideWhenUsed="1"/>
     <w:lsdException w:name="Body Text" w:semiHidden="1" w:unhideWhenUsed="1"/>
     <w:lsdException w:name="Body Text Indent" w:semiHidden="1" w:unhideWhenUsed="1"/>
     <w:lsdException w:name="List Continue" w:semiHidden="1" w:unhideWhenUsed="1"/>
@@ -620,8 +577,8 @@
     <w:lsdException w:name="Subtle Reference" w:uiPriority="31" w:qFormat="1"/>
     <w:lsdException w:name="Intense Reference" w:uiPriority="32" w:qFormat="1"/>
     <w:lsdException w:name="Book Title" w:uiPriority="33" w:qFormat="1"/>
-    <w:lsdException w:name="Bibliography" w:uiPriority="37" w:semiHidden="1" w:unhideWhenUsed="1"/>
-    <w:lsdException w:name="TOC Heading" w:uiPriority="39" w:semiHidden="1" w:unhideWhenUsed="1" w:qFormat="1"/>
+    <w:lsdException w:name="Bibliography" w:semiHidden="1" w:uiPriority="37" w:unhideWhenUsed="1"/>
+    <w:lsdException w:name="TOC Heading" w:semiHidden="1" w:uiPriority="39" w:unhideWhenUsed="1" w:qFormat="1"/>
     <w:lsdException w:name="Plain Table 1" w:uiPriority="41"/>
     <w:lsdException w:name="Plain Table 2" w:uiPriority="42"/>
     <w:lsdException w:name="Plain Table 3" w:uiPriority="43"/>
@@ -729,60 +686,48 @@
     <w:lsdException w:name="Mention" w:semiHidden="1" w:unhideWhenUsed="1"/>
     <w:lsdException w:name="Smart Hyperlink" w:semiHidden="1" w:unhideWhenUsed="1"/>
   </w:latentStyles>
-  <w:style w:type="paragraph" w:styleId="Normal" w:default="1">
+  <w:style w:type="paragraph" w:default="1" w:styleId="Normal">
     <w:name w:val="Normal"/>
     <w:qFormat/>
     <w:pPr>
-      <w:widowControl/>
-      <w:bidi w:val="0"/>
-      <w:spacing w:lineRule="auto" w:line="259" w:before="0" w:after="160"/>
-      <w:jc w:val="left"/>
+      <w:spacing w:after="160" w:line="259" w:lineRule="auto"/>
     </w:pPr>
-    <w:rPr>
-      <w:rFonts w:ascii="Calibri" w:hAnsi="Calibri" w:eastAsia="Calibri" w:cs="" w:asciiTheme="minorHAnsi" w:cstheme="minorBidi" w:eastAsiaTheme="minorHAnsi" w:hAnsiTheme="minorHAnsi"/>
-      <w:color w:val="auto"/>
-      <w:kern w:val="0"/>
-      <w:sz w:val="22"/>
-      <w:szCs w:val="22"/>
-      <w:lang w:val="en-US" w:eastAsia="en-US" w:bidi="ar-SA"/>
-    </w:rPr>
   </w:style>
   <w:style w:type="paragraph" w:styleId="Heading1">
-    <w:name w:val="Heading 1"/>
+    <w:name w:val="heading 1"/>
     <w:basedOn w:val="Normal"/>
     <w:next w:val="Normal"/>
     <w:link w:val="Heading1Char"/>
     <w:uiPriority w:val="9"/>
     <w:qFormat/>
-    <w:rsid w:val="004d7062"/>
+    <w:rsid w:val="004D7062"/>
     <w:pPr>
-      <w:keepNext w:val="true"/>
+      <w:keepNext/>
       <w:keepLines/>
       <w:numPr>
-        <w:ilvl w:val="0"/>
         <w:numId w:val="1"/>
       </w:numPr>
       <w:spacing w:before="240" w:after="0"/>
       <w:outlineLvl w:val="0"/>
     </w:pPr>
     <w:rPr>
-      <w:rFonts w:ascii="Calibri Light" w:hAnsi="Calibri Light" w:eastAsia="" w:cs="" w:asciiTheme="majorHAnsi" w:cstheme="majorBidi" w:eastAsiaTheme="majorEastAsia" w:hAnsiTheme="majorHAnsi"/>
-      <w:color w:val="2E74B5" w:themeColor="accent1" w:themeShade="bf"/>
+      <w:rFonts w:asciiTheme="majorHAnsi" w:eastAsiaTheme="majorEastAsia" w:hAnsiTheme="majorHAnsi" w:cstheme="majorBidi"/>
+      <w:color w:val="2E74B5" w:themeColor="accent1" w:themeShade="BF"/>
       <w:sz w:val="32"/>
       <w:szCs w:val="32"/>
     </w:rPr>
   </w:style>
   <w:style w:type="paragraph" w:styleId="Heading2">
-    <w:name w:val="Heading 2"/>
+    <w:name w:val="heading 2"/>
     <w:basedOn w:val="Normal"/>
     <w:next w:val="Normal"/>
     <w:link w:val="Heading2Char"/>
     <w:uiPriority w:val="9"/>
     <w:unhideWhenUsed/>
     <w:qFormat/>
-    <w:rsid w:val="004d7062"/>
+    <w:rsid w:val="004D7062"/>
     <w:pPr>
-      <w:keepNext w:val="true"/>
+      <w:keepNext/>
       <w:keepLines/>
       <w:numPr>
         <w:ilvl w:val="1"/>
@@ -792,23 +737,23 @@
       <w:outlineLvl w:val="1"/>
     </w:pPr>
     <w:rPr>
-      <w:rFonts w:ascii="Calibri Light" w:hAnsi="Calibri Light" w:eastAsia="" w:cs="" w:asciiTheme="majorHAnsi" w:cstheme="majorBidi" w:eastAsiaTheme="majorEastAsia" w:hAnsiTheme="majorHAnsi"/>
-      <w:color w:val="2E74B5" w:themeColor="accent1" w:themeShade="bf"/>
+      <w:rFonts w:asciiTheme="majorHAnsi" w:eastAsiaTheme="majorEastAsia" w:hAnsiTheme="majorHAnsi" w:cstheme="majorBidi"/>
+      <w:color w:val="2E74B5" w:themeColor="accent1" w:themeShade="BF"/>
       <w:sz w:val="26"/>
       <w:szCs w:val="26"/>
     </w:rPr>
   </w:style>
   <w:style w:type="paragraph" w:styleId="Heading3">
-    <w:name w:val="Heading 3"/>
+    <w:name w:val="heading 3"/>
     <w:basedOn w:val="Normal"/>
     <w:next w:val="Normal"/>
     <w:link w:val="Heading3Char"/>
     <w:uiPriority w:val="9"/>
     <w:unhideWhenUsed/>
     <w:qFormat/>
-    <w:rsid w:val="004d7062"/>
+    <w:rsid w:val="004D7062"/>
     <w:pPr>
-      <w:keepNext w:val="true"/>
+      <w:keepNext/>
       <w:keepLines/>
       <w:numPr>
         <w:ilvl w:val="2"/>
@@ -818,14 +763,14 @@
       <w:outlineLvl w:val="2"/>
     </w:pPr>
     <w:rPr>
-      <w:rFonts w:ascii="Calibri Light" w:hAnsi="Calibri Light" w:eastAsia="" w:cs="" w:asciiTheme="majorHAnsi" w:cstheme="majorBidi" w:eastAsiaTheme="majorEastAsia" w:hAnsiTheme="majorHAnsi"/>
-      <w:color w:val="1F4D78" w:themeColor="accent1" w:themeShade="7f"/>
+      <w:rFonts w:asciiTheme="majorHAnsi" w:eastAsiaTheme="majorEastAsia" w:hAnsiTheme="majorHAnsi" w:cstheme="majorBidi"/>
+      <w:color w:val="1F4D78" w:themeColor="accent1" w:themeShade="7F"/>
       <w:sz w:val="24"/>
       <w:szCs w:val="24"/>
     </w:rPr>
   </w:style>
   <w:style w:type="paragraph" w:styleId="Heading4">
-    <w:name w:val="Heading 4"/>
+    <w:name w:val="heading 4"/>
     <w:basedOn w:val="Normal"/>
     <w:next w:val="Normal"/>
     <w:link w:val="Heading4Char"/>
@@ -833,9 +778,9 @@
     <w:semiHidden/>
     <w:unhideWhenUsed/>
     <w:qFormat/>
-    <w:rsid w:val="004d7062"/>
+    <w:rsid w:val="004D7062"/>
     <w:pPr>
-      <w:keepNext w:val="true"/>
+      <w:keepNext/>
       <w:keepLines/>
       <w:numPr>
         <w:ilvl w:val="3"/>
@@ -845,14 +790,14 @@
       <w:outlineLvl w:val="3"/>
     </w:pPr>
     <w:rPr>
-      <w:rFonts w:ascii="Calibri Light" w:hAnsi="Calibri Light" w:eastAsia="" w:cs="" w:asciiTheme="majorHAnsi" w:cstheme="majorBidi" w:eastAsiaTheme="majorEastAsia" w:hAnsiTheme="majorHAnsi"/>
+      <w:rFonts w:asciiTheme="majorHAnsi" w:eastAsiaTheme="majorEastAsia" w:hAnsiTheme="majorHAnsi" w:cstheme="majorBidi"/>
       <w:i/>
       <w:iCs/>
-      <w:color w:val="2E74B5" w:themeColor="accent1" w:themeShade="bf"/>
+      <w:color w:val="2E74B5" w:themeColor="accent1" w:themeShade="BF"/>
     </w:rPr>
   </w:style>
   <w:style w:type="paragraph" w:styleId="Heading5">
-    <w:name w:val="Heading 5"/>
+    <w:name w:val="heading 5"/>
     <w:basedOn w:val="Normal"/>
     <w:next w:val="Normal"/>
     <w:link w:val="Heading5Char"/>
@@ -860,9 +805,9 @@
     <w:semiHidden/>
     <w:unhideWhenUsed/>
     <w:qFormat/>
-    <w:rsid w:val="004d7062"/>
+    <w:rsid w:val="004D7062"/>
     <w:pPr>
-      <w:keepNext w:val="true"/>
+      <w:keepNext/>
       <w:keepLines/>
       <w:numPr>
         <w:ilvl w:val="4"/>
@@ -872,12 +817,12 @@
       <w:outlineLvl w:val="4"/>
     </w:pPr>
     <w:rPr>
-      <w:rFonts w:ascii="Calibri Light" w:hAnsi="Calibri Light" w:eastAsia="" w:cs="" w:asciiTheme="majorHAnsi" w:cstheme="majorBidi" w:eastAsiaTheme="majorEastAsia" w:hAnsiTheme="majorHAnsi"/>
-      <w:color w:val="2E74B5" w:themeColor="accent1" w:themeShade="bf"/>
+      <w:rFonts w:asciiTheme="majorHAnsi" w:eastAsiaTheme="majorEastAsia" w:hAnsiTheme="majorHAnsi" w:cstheme="majorBidi"/>
+      <w:color w:val="2E74B5" w:themeColor="accent1" w:themeShade="BF"/>
     </w:rPr>
   </w:style>
   <w:style w:type="paragraph" w:styleId="Heading6">
-    <w:name w:val="Heading 6"/>
+    <w:name w:val="heading 6"/>
     <w:basedOn w:val="Normal"/>
     <w:next w:val="Normal"/>
     <w:link w:val="Heading6Char"/>
@@ -885,9 +830,9 @@
     <w:semiHidden/>
     <w:unhideWhenUsed/>
     <w:qFormat/>
-    <w:rsid w:val="004d7062"/>
+    <w:rsid w:val="004D7062"/>
     <w:pPr>
-      <w:keepNext w:val="true"/>
+      <w:keepNext/>
       <w:keepLines/>
       <w:numPr>
         <w:ilvl w:val="5"/>
@@ -897,12 +842,12 @@
       <w:outlineLvl w:val="5"/>
     </w:pPr>
     <w:rPr>
-      <w:rFonts w:ascii="Calibri Light" w:hAnsi="Calibri Light" w:eastAsia="" w:cs="" w:asciiTheme="majorHAnsi" w:cstheme="majorBidi" w:eastAsiaTheme="majorEastAsia" w:hAnsiTheme="majorHAnsi"/>
-      <w:color w:val="1F4D78" w:themeColor="accent1" w:themeShade="7f"/>
+      <w:rFonts w:asciiTheme="majorHAnsi" w:eastAsiaTheme="majorEastAsia" w:hAnsiTheme="majorHAnsi" w:cstheme="majorBidi"/>
+      <w:color w:val="1F4D78" w:themeColor="accent1" w:themeShade="7F"/>
     </w:rPr>
   </w:style>
   <w:style w:type="paragraph" w:styleId="Heading7">
-    <w:name w:val="Heading 7"/>
+    <w:name w:val="heading 7"/>
     <w:basedOn w:val="Normal"/>
     <w:next w:val="Normal"/>
     <w:link w:val="Heading7Char"/>
@@ -910,9 +855,9 @@
     <w:semiHidden/>
     <w:unhideWhenUsed/>
     <w:qFormat/>
-    <w:rsid w:val="004d7062"/>
+    <w:rsid w:val="004D7062"/>
     <w:pPr>
-      <w:keepNext w:val="true"/>
+      <w:keepNext/>
       <w:keepLines/>
       <w:numPr>
         <w:ilvl w:val="6"/>
@@ -922,14 +867,14 @@
       <w:outlineLvl w:val="6"/>
     </w:pPr>
     <w:rPr>
-      <w:rFonts w:ascii="Calibri Light" w:hAnsi="Calibri Light" w:eastAsia="" w:cs="" w:asciiTheme="majorHAnsi" w:cstheme="majorBidi" w:eastAsiaTheme="majorEastAsia" w:hAnsiTheme="majorHAnsi"/>
+      <w:rFonts w:asciiTheme="majorHAnsi" w:eastAsiaTheme="majorEastAsia" w:hAnsiTheme="majorHAnsi" w:cstheme="majorBidi"/>
       <w:i/>
       <w:iCs/>
-      <w:color w:val="1F4D78" w:themeColor="accent1" w:themeShade="7f"/>
+      <w:color w:val="1F4D78" w:themeColor="accent1" w:themeShade="7F"/>
     </w:rPr>
   </w:style>
   <w:style w:type="paragraph" w:styleId="Heading8">
-    <w:name w:val="Heading 8"/>
+    <w:name w:val="heading 8"/>
     <w:basedOn w:val="Normal"/>
     <w:next w:val="Normal"/>
     <w:link w:val="Heading8Char"/>
@@ -937,9 +882,9 @@
     <w:semiHidden/>
     <w:unhideWhenUsed/>
     <w:qFormat/>
-    <w:rsid w:val="004d7062"/>
+    <w:rsid w:val="004D7062"/>
     <w:pPr>
-      <w:keepNext w:val="true"/>
+      <w:keepNext/>
       <w:keepLines/>
       <w:numPr>
         <w:ilvl w:val="7"/>
@@ -949,14 +894,14 @@
       <w:outlineLvl w:val="7"/>
     </w:pPr>
     <w:rPr>
-      <w:rFonts w:ascii="Calibri Light" w:hAnsi="Calibri Light" w:eastAsia="" w:cs="" w:asciiTheme="majorHAnsi" w:cstheme="majorBidi" w:eastAsiaTheme="majorEastAsia" w:hAnsiTheme="majorHAnsi"/>
-      <w:color w:val="272727" w:themeColor="text1" w:themeTint="d8"/>
+      <w:rFonts w:asciiTheme="majorHAnsi" w:eastAsiaTheme="majorEastAsia" w:hAnsiTheme="majorHAnsi" w:cstheme="majorBidi"/>
+      <w:color w:val="272727" w:themeColor="text1" w:themeTint="D8"/>
       <w:sz w:val="21"/>
       <w:szCs w:val="21"/>
     </w:rPr>
   </w:style>
   <w:style w:type="paragraph" w:styleId="Heading9">
-    <w:name w:val="Heading 9"/>
+    <w:name w:val="heading 9"/>
     <w:basedOn w:val="Normal"/>
     <w:next w:val="Normal"/>
     <w:link w:val="Heading9Char"/>
@@ -964,9 +909,9 @@
     <w:semiHidden/>
     <w:unhideWhenUsed/>
     <w:qFormat/>
-    <w:rsid w:val="004d7062"/>
+    <w:rsid w:val="004D7062"/>
     <w:pPr>
-      <w:keepNext w:val="true"/>
+      <w:keepNext/>
       <w:keepLines/>
       <w:numPr>
         <w:ilvl w:val="8"/>
@@ -976,251 +921,19 @@
       <w:outlineLvl w:val="8"/>
     </w:pPr>
     <w:rPr>
-      <w:rFonts w:ascii="Calibri Light" w:hAnsi="Calibri Light" w:eastAsia="" w:cs="" w:asciiTheme="majorHAnsi" w:cstheme="majorBidi" w:eastAsiaTheme="majorEastAsia" w:hAnsiTheme="majorHAnsi"/>
+      <w:rFonts w:asciiTheme="majorHAnsi" w:eastAsiaTheme="majorEastAsia" w:hAnsiTheme="majorHAnsi" w:cstheme="majorBidi"/>
       <w:i/>
       <w:iCs/>
-      <w:color w:val="272727" w:themeColor="text1" w:themeTint="d8"/>
+      <w:color w:val="272727" w:themeColor="text1" w:themeTint="D8"/>
       <w:sz w:val="21"/>
       <w:szCs w:val="21"/>
     </w:rPr>
   </w:style>
-  <w:style w:type="character" w:styleId="DefaultParagraphFont" w:default="1">
+  <w:style w:type="character" w:default="1" w:styleId="DefaultParagraphFont">
     <w:name w:val="Default Paragraph Font"/>
     <w:uiPriority w:val="1"/>
     <w:semiHidden/>
     <w:unhideWhenUsed/>
-    <w:qFormat/>
-    <w:rPr/>
-  </w:style>
-  <w:style w:type="character" w:styleId="TitleChar" w:customStyle="1">
-    <w:name w:val="Title Char"/>
-    <w:basedOn w:val="DefaultParagraphFont"/>
-    <w:link w:val="Title"/>
-    <w:uiPriority w:val="10"/>
-    <w:qFormat/>
-    <w:rsid w:val="004d7062"/>
-    <w:rPr>
-      <w:rFonts w:ascii="Calibri Light" w:hAnsi="Calibri Light" w:eastAsia="" w:cs="" w:asciiTheme="majorHAnsi" w:cstheme="majorBidi" w:eastAsiaTheme="majorEastAsia" w:hAnsiTheme="majorHAnsi"/>
-      <w:spacing w:val="-10"/>
-      <w:kern w:val="2"/>
-      <w:sz w:val="56"/>
-      <w:szCs w:val="56"/>
-    </w:rPr>
-  </w:style>
-  <w:style w:type="character" w:styleId="Heading1Char" w:customStyle="1">
-    <w:name w:val="Heading 1 Char"/>
-    <w:basedOn w:val="DefaultParagraphFont"/>
-    <w:link w:val="Heading1"/>
-    <w:uiPriority w:val="9"/>
-    <w:qFormat/>
-    <w:rsid w:val="004d7062"/>
-    <w:rPr>
-      <w:rFonts w:ascii="Calibri Light" w:hAnsi="Calibri Light" w:eastAsia="" w:cs="" w:asciiTheme="majorHAnsi" w:cstheme="majorBidi" w:eastAsiaTheme="majorEastAsia" w:hAnsiTheme="majorHAnsi"/>
-      <w:color w:val="2E74B5" w:themeColor="accent1" w:themeShade="bf"/>
-      <w:sz w:val="32"/>
-      <w:szCs w:val="32"/>
-    </w:rPr>
-  </w:style>
-  <w:style w:type="character" w:styleId="Heading2Char" w:customStyle="1">
-    <w:name w:val="Heading 2 Char"/>
-    <w:basedOn w:val="DefaultParagraphFont"/>
-    <w:link w:val="Heading2"/>
-    <w:uiPriority w:val="9"/>
-    <w:qFormat/>
-    <w:rsid w:val="004d7062"/>
-    <w:rPr>
-      <w:rFonts w:ascii="Calibri Light" w:hAnsi="Calibri Light" w:eastAsia="" w:cs="" w:asciiTheme="majorHAnsi" w:cstheme="majorBidi" w:eastAsiaTheme="majorEastAsia" w:hAnsiTheme="majorHAnsi"/>
-      <w:color w:val="2E74B5" w:themeColor="accent1" w:themeShade="bf"/>
-      <w:sz w:val="26"/>
-      <w:szCs w:val="26"/>
-    </w:rPr>
-  </w:style>
-  <w:style w:type="character" w:styleId="Heading3Char" w:customStyle="1">
-    <w:name w:val="Heading 3 Char"/>
-    <w:basedOn w:val="DefaultParagraphFont"/>
-    <w:link w:val="Heading3"/>
-    <w:uiPriority w:val="9"/>
-    <w:qFormat/>
-    <w:rsid w:val="004d7062"/>
-    <w:rPr>
-      <w:rFonts w:ascii="Calibri Light" w:hAnsi="Calibri Light" w:eastAsia="" w:cs="" w:asciiTheme="majorHAnsi" w:cstheme="majorBidi" w:eastAsiaTheme="majorEastAsia" w:hAnsiTheme="majorHAnsi"/>
-      <w:color w:val="1F4D78" w:themeColor="accent1" w:themeShade="7f"/>
-      <w:sz w:val="24"/>
-      <w:szCs w:val="24"/>
-    </w:rPr>
-  </w:style>
-  <w:style w:type="character" w:styleId="Heading4Char" w:customStyle="1">
-    <w:name w:val="Heading 4 Char"/>
-    <w:basedOn w:val="DefaultParagraphFont"/>
-    <w:link w:val="Heading4"/>
-    <w:uiPriority w:val="9"/>
-    <w:semiHidden/>
-    <w:qFormat/>
-    <w:rsid w:val="004d7062"/>
-    <w:rPr>
-      <w:rFonts w:ascii="Calibri Light" w:hAnsi="Calibri Light" w:eastAsia="" w:cs="" w:asciiTheme="majorHAnsi" w:cstheme="majorBidi" w:eastAsiaTheme="majorEastAsia" w:hAnsiTheme="majorHAnsi"/>
-      <w:i/>
-      <w:iCs/>
-      <w:color w:val="2E74B5" w:themeColor="accent1" w:themeShade="bf"/>
-    </w:rPr>
-  </w:style>
-  <w:style w:type="character" w:styleId="Heading5Char" w:customStyle="1">
-    <w:name w:val="Heading 5 Char"/>
-    <w:basedOn w:val="DefaultParagraphFont"/>
-    <w:link w:val="Heading5"/>
-    <w:uiPriority w:val="9"/>
-    <w:semiHidden/>
-    <w:qFormat/>
-    <w:rsid w:val="004d7062"/>
-    <w:rPr>
-      <w:rFonts w:ascii="Calibri Light" w:hAnsi="Calibri Light" w:eastAsia="" w:cs="" w:asciiTheme="majorHAnsi" w:cstheme="majorBidi" w:eastAsiaTheme="majorEastAsia" w:hAnsiTheme="majorHAnsi"/>
-      <w:color w:val="2E74B5" w:themeColor="accent1" w:themeShade="bf"/>
-    </w:rPr>
-  </w:style>
-  <w:style w:type="character" w:styleId="Heading6Char" w:customStyle="1">
-    <w:name w:val="Heading 6 Char"/>
-    <w:basedOn w:val="DefaultParagraphFont"/>
-    <w:link w:val="Heading6"/>
-    <w:uiPriority w:val="9"/>
-    <w:semiHidden/>
-    <w:qFormat/>
-    <w:rsid w:val="004d7062"/>
-    <w:rPr>
-      <w:rFonts w:ascii="Calibri Light" w:hAnsi="Calibri Light" w:eastAsia="" w:cs="" w:asciiTheme="majorHAnsi" w:cstheme="majorBidi" w:eastAsiaTheme="majorEastAsia" w:hAnsiTheme="majorHAnsi"/>
-      <w:color w:val="1F4D78" w:themeColor="accent1" w:themeShade="7f"/>
-    </w:rPr>
-  </w:style>
-  <w:style w:type="character" w:styleId="Heading7Char" w:customStyle="1">
-    <w:name w:val="Heading 7 Char"/>
-    <w:basedOn w:val="DefaultParagraphFont"/>
-    <w:link w:val="Heading7"/>
-    <w:uiPriority w:val="9"/>
-    <w:semiHidden/>
-    <w:qFormat/>
-    <w:rsid w:val="004d7062"/>
-    <w:rPr>
-      <w:rFonts w:ascii="Calibri Light" w:hAnsi="Calibri Light" w:eastAsia="" w:cs="" w:asciiTheme="majorHAnsi" w:cstheme="majorBidi" w:eastAsiaTheme="majorEastAsia" w:hAnsiTheme="majorHAnsi"/>
-      <w:i/>
-      <w:iCs/>
-      <w:color w:val="1F4D78" w:themeColor="accent1" w:themeShade="7f"/>
-    </w:rPr>
-  </w:style>
-  <w:style w:type="character" w:styleId="Heading8Char" w:customStyle="1">
-    <w:name w:val="Heading 8 Char"/>
-    <w:basedOn w:val="DefaultParagraphFont"/>
-    <w:link w:val="Heading8"/>
-    <w:uiPriority w:val="9"/>
-    <w:semiHidden/>
-    <w:qFormat/>
-    <w:rsid w:val="004d7062"/>
-    <w:rPr>
-      <w:rFonts w:ascii="Calibri Light" w:hAnsi="Calibri Light" w:eastAsia="" w:cs="" w:asciiTheme="majorHAnsi" w:cstheme="majorBidi" w:eastAsiaTheme="majorEastAsia" w:hAnsiTheme="majorHAnsi"/>
-      <w:color w:val="272727" w:themeColor="text1" w:themeTint="d8"/>
-      <w:sz w:val="21"/>
-      <w:szCs w:val="21"/>
-    </w:rPr>
-  </w:style>
-  <w:style w:type="character" w:styleId="Heading9Char" w:customStyle="1">
-    <w:name w:val="Heading 9 Char"/>
-    <w:basedOn w:val="DefaultParagraphFont"/>
-    <w:link w:val="Heading9"/>
-    <w:uiPriority w:val="9"/>
-    <w:semiHidden/>
-    <w:qFormat/>
-    <w:rsid w:val="004d7062"/>
-    <w:rPr>
-      <w:rFonts w:ascii="Calibri Light" w:hAnsi="Calibri Light" w:eastAsia="" w:cs="" w:asciiTheme="majorHAnsi" w:cstheme="majorBidi" w:eastAsiaTheme="majorEastAsia" w:hAnsiTheme="majorHAnsi"/>
-      <w:i/>
-      <w:iCs/>
-      <w:color w:val="272727" w:themeColor="text1" w:themeTint="d8"/>
-      <w:sz w:val="21"/>
-      <w:szCs w:val="21"/>
-    </w:rPr>
-  </w:style>
-  <w:style w:type="paragraph" w:styleId="Heading">
-    <w:name w:val="Heading"/>
-    <w:basedOn w:val="Normal"/>
-    <w:next w:val="TextBody"/>
-    <w:qFormat/>
-    <w:pPr>
-      <w:keepNext w:val="true"/>
-      <w:spacing w:before="240" w:after="120"/>
-    </w:pPr>
-    <w:rPr>
-      <w:rFonts w:ascii="Liberation Sans" w:hAnsi="Liberation Sans" w:eastAsia="Source Han Sans CN" w:cs="Droid Sans Devanagari"/>
-      <w:sz w:val="28"/>
-      <w:szCs w:val="28"/>
-    </w:rPr>
-  </w:style>
-  <w:style w:type="paragraph" w:styleId="TextBody">
-    <w:name w:val="Body Text"/>
-    <w:basedOn w:val="Normal"/>
-    <w:pPr>
-      <w:spacing w:lineRule="auto" w:line="276" w:before="0" w:after="140"/>
-    </w:pPr>
-    <w:rPr/>
-  </w:style>
-  <w:style w:type="paragraph" w:styleId="List">
-    <w:name w:val="List"/>
-    <w:basedOn w:val="TextBody"/>
-    <w:pPr/>
-    <w:rPr>
-      <w:rFonts w:cs="Droid Sans Devanagari"/>
-    </w:rPr>
-  </w:style>
-  <w:style w:type="paragraph" w:styleId="Caption">
-    <w:name w:val="Caption"/>
-    <w:basedOn w:val="Normal"/>
-    <w:qFormat/>
-    <w:pPr>
-      <w:suppressLineNumbers/>
-      <w:spacing w:before="120" w:after="120"/>
-    </w:pPr>
-    <w:rPr>
-      <w:rFonts w:cs="Droid Sans Devanagari"/>
-      <w:i/>
-      <w:iCs/>
-      <w:sz w:val="24"/>
-      <w:szCs w:val="24"/>
-    </w:rPr>
-  </w:style>
-  <w:style w:type="paragraph" w:styleId="Index">
-    <w:name w:val="Index"/>
-    <w:basedOn w:val="Normal"/>
-    <w:qFormat/>
-    <w:pPr>
-      <w:suppressLineNumbers/>
-    </w:pPr>
-    <w:rPr>
-      <w:rFonts w:cs="Droid Sans Devanagari"/>
-    </w:rPr>
-  </w:style>
-  <w:style w:type="paragraph" w:styleId="Title">
-    <w:name w:val="Title"/>
-    <w:basedOn w:val="Normal"/>
-    <w:next w:val="Normal"/>
-    <w:link w:val="TitleChar"/>
-    <w:uiPriority w:val="10"/>
-    <w:qFormat/>
-    <w:rsid w:val="004d7062"/>
-    <w:pPr>
-      <w:spacing w:lineRule="auto" w:line="240" w:before="0" w:after="0"/>
-      <w:contextualSpacing/>
-    </w:pPr>
-    <w:rPr>
-      <w:rFonts w:ascii="Calibri Light" w:hAnsi="Calibri Light" w:eastAsia="" w:cs="" w:asciiTheme="majorHAnsi" w:cstheme="majorBidi" w:eastAsiaTheme="majorEastAsia" w:hAnsiTheme="majorHAnsi"/>
-      <w:spacing w:val="-10"/>
-      <w:kern w:val="2"/>
-      <w:sz w:val="56"/>
-      <w:szCs w:val="56"/>
-    </w:rPr>
-  </w:style>
-  <w:style w:type="numbering" w:styleId="NoList" w:default="1">
-    <w:name w:val="No List"/>
-    <w:uiPriority w:val="99"/>
-    <w:semiHidden/>
-    <w:unhideWhenUsed/>
-    <w:qFormat/>
   </w:style>
   <w:style w:type="table" w:default="1" w:styleId="TableNormal">
     <w:name w:val="Normal Table"/>
@@ -1228,6 +941,7 @@
     <w:semiHidden/>
     <w:unhideWhenUsed/>
     <w:tblPr>
+      <w:tblInd w:w="0" w:type="dxa"/>
       <w:tblCellMar>
         <w:top w:w="0" w:type="dxa"/>
         <w:left w:w="108" w:type="dxa"/>
@@ -1235,6 +949,233 @@
         <w:right w:w="108" w:type="dxa"/>
       </w:tblCellMar>
     </w:tblPr>
+  </w:style>
+  <w:style w:type="numbering" w:default="1" w:styleId="NoList">
+    <w:name w:val="No List"/>
+    <w:uiPriority w:val="99"/>
+    <w:semiHidden/>
+    <w:unhideWhenUsed/>
+  </w:style>
+  <w:style w:type="character" w:customStyle="1" w:styleId="TitleChar">
+    <w:name w:val="Title Char"/>
+    <w:basedOn w:val="DefaultParagraphFont"/>
+    <w:link w:val="Title"/>
+    <w:uiPriority w:val="10"/>
+    <w:qFormat/>
+    <w:rsid w:val="004D7062"/>
+    <w:rPr>
+      <w:rFonts w:asciiTheme="majorHAnsi" w:eastAsiaTheme="majorEastAsia" w:hAnsiTheme="majorHAnsi" w:cstheme="majorBidi"/>
+      <w:spacing w:val="-10"/>
+      <w:kern w:val="2"/>
+      <w:sz w:val="56"/>
+      <w:szCs w:val="56"/>
+    </w:rPr>
+  </w:style>
+  <w:style w:type="character" w:customStyle="1" w:styleId="Heading1Char">
+    <w:name w:val="Heading 1 Char"/>
+    <w:basedOn w:val="DefaultParagraphFont"/>
+    <w:link w:val="Heading1"/>
+    <w:uiPriority w:val="9"/>
+    <w:qFormat/>
+    <w:rsid w:val="004D7062"/>
+    <w:rPr>
+      <w:rFonts w:asciiTheme="majorHAnsi" w:eastAsiaTheme="majorEastAsia" w:hAnsiTheme="majorHAnsi" w:cstheme="majorBidi"/>
+      <w:color w:val="2E74B5" w:themeColor="accent1" w:themeShade="BF"/>
+      <w:sz w:val="32"/>
+      <w:szCs w:val="32"/>
+    </w:rPr>
+  </w:style>
+  <w:style w:type="character" w:customStyle="1" w:styleId="Heading2Char">
+    <w:name w:val="Heading 2 Char"/>
+    <w:basedOn w:val="DefaultParagraphFont"/>
+    <w:link w:val="Heading2"/>
+    <w:uiPriority w:val="9"/>
+    <w:qFormat/>
+    <w:rsid w:val="004D7062"/>
+    <w:rPr>
+      <w:rFonts w:asciiTheme="majorHAnsi" w:eastAsiaTheme="majorEastAsia" w:hAnsiTheme="majorHAnsi" w:cstheme="majorBidi"/>
+      <w:color w:val="2E74B5" w:themeColor="accent1" w:themeShade="BF"/>
+      <w:sz w:val="26"/>
+      <w:szCs w:val="26"/>
+    </w:rPr>
+  </w:style>
+  <w:style w:type="character" w:customStyle="1" w:styleId="Heading3Char">
+    <w:name w:val="Heading 3 Char"/>
+    <w:basedOn w:val="DefaultParagraphFont"/>
+    <w:link w:val="Heading3"/>
+    <w:uiPriority w:val="9"/>
+    <w:qFormat/>
+    <w:rsid w:val="004D7062"/>
+    <w:rPr>
+      <w:rFonts w:asciiTheme="majorHAnsi" w:eastAsiaTheme="majorEastAsia" w:hAnsiTheme="majorHAnsi" w:cstheme="majorBidi"/>
+      <w:color w:val="1F4D78" w:themeColor="accent1" w:themeShade="7F"/>
+      <w:sz w:val="24"/>
+      <w:szCs w:val="24"/>
+    </w:rPr>
+  </w:style>
+  <w:style w:type="character" w:customStyle="1" w:styleId="Heading4Char">
+    <w:name w:val="Heading 4 Char"/>
+    <w:basedOn w:val="DefaultParagraphFont"/>
+    <w:link w:val="Heading4"/>
+    <w:uiPriority w:val="9"/>
+    <w:semiHidden/>
+    <w:qFormat/>
+    <w:rsid w:val="004D7062"/>
+    <w:rPr>
+      <w:rFonts w:asciiTheme="majorHAnsi" w:eastAsiaTheme="majorEastAsia" w:hAnsiTheme="majorHAnsi" w:cstheme="majorBidi"/>
+      <w:i/>
+      <w:iCs/>
+      <w:color w:val="2E74B5" w:themeColor="accent1" w:themeShade="BF"/>
+    </w:rPr>
+  </w:style>
+  <w:style w:type="character" w:customStyle="1" w:styleId="Heading5Char">
+    <w:name w:val="Heading 5 Char"/>
+    <w:basedOn w:val="DefaultParagraphFont"/>
+    <w:link w:val="Heading5"/>
+    <w:uiPriority w:val="9"/>
+    <w:semiHidden/>
+    <w:qFormat/>
+    <w:rsid w:val="004D7062"/>
+    <w:rPr>
+      <w:rFonts w:asciiTheme="majorHAnsi" w:eastAsiaTheme="majorEastAsia" w:hAnsiTheme="majorHAnsi" w:cstheme="majorBidi"/>
+      <w:color w:val="2E74B5" w:themeColor="accent1" w:themeShade="BF"/>
+    </w:rPr>
+  </w:style>
+  <w:style w:type="character" w:customStyle="1" w:styleId="Heading6Char">
+    <w:name w:val="Heading 6 Char"/>
+    <w:basedOn w:val="DefaultParagraphFont"/>
+    <w:link w:val="Heading6"/>
+    <w:uiPriority w:val="9"/>
+    <w:semiHidden/>
+    <w:qFormat/>
+    <w:rsid w:val="004D7062"/>
+    <w:rPr>
+      <w:rFonts w:asciiTheme="majorHAnsi" w:eastAsiaTheme="majorEastAsia" w:hAnsiTheme="majorHAnsi" w:cstheme="majorBidi"/>
+      <w:color w:val="1F4D78" w:themeColor="accent1" w:themeShade="7F"/>
+    </w:rPr>
+  </w:style>
+  <w:style w:type="character" w:customStyle="1" w:styleId="Heading7Char">
+    <w:name w:val="Heading 7 Char"/>
+    <w:basedOn w:val="DefaultParagraphFont"/>
+    <w:link w:val="Heading7"/>
+    <w:uiPriority w:val="9"/>
+    <w:semiHidden/>
+    <w:qFormat/>
+    <w:rsid w:val="004D7062"/>
+    <w:rPr>
+      <w:rFonts w:asciiTheme="majorHAnsi" w:eastAsiaTheme="majorEastAsia" w:hAnsiTheme="majorHAnsi" w:cstheme="majorBidi"/>
+      <w:i/>
+      <w:iCs/>
+      <w:color w:val="1F4D78" w:themeColor="accent1" w:themeShade="7F"/>
+    </w:rPr>
+  </w:style>
+  <w:style w:type="character" w:customStyle="1" w:styleId="Heading8Char">
+    <w:name w:val="Heading 8 Char"/>
+    <w:basedOn w:val="DefaultParagraphFont"/>
+    <w:link w:val="Heading8"/>
+    <w:uiPriority w:val="9"/>
+    <w:semiHidden/>
+    <w:qFormat/>
+    <w:rsid w:val="004D7062"/>
+    <w:rPr>
+      <w:rFonts w:asciiTheme="majorHAnsi" w:eastAsiaTheme="majorEastAsia" w:hAnsiTheme="majorHAnsi" w:cstheme="majorBidi"/>
+      <w:color w:val="272727" w:themeColor="text1" w:themeTint="D8"/>
+      <w:sz w:val="21"/>
+      <w:szCs w:val="21"/>
+    </w:rPr>
+  </w:style>
+  <w:style w:type="character" w:customStyle="1" w:styleId="Heading9Char">
+    <w:name w:val="Heading 9 Char"/>
+    <w:basedOn w:val="DefaultParagraphFont"/>
+    <w:link w:val="Heading9"/>
+    <w:uiPriority w:val="9"/>
+    <w:semiHidden/>
+    <w:qFormat/>
+    <w:rsid w:val="004D7062"/>
+    <w:rPr>
+      <w:rFonts w:asciiTheme="majorHAnsi" w:eastAsiaTheme="majorEastAsia" w:hAnsiTheme="majorHAnsi" w:cstheme="majorBidi"/>
+      <w:i/>
+      <w:iCs/>
+      <w:color w:val="272727" w:themeColor="text1" w:themeTint="D8"/>
+      <w:sz w:val="21"/>
+      <w:szCs w:val="21"/>
+    </w:rPr>
+  </w:style>
+  <w:style w:type="paragraph" w:customStyle="1" w:styleId="Heading">
+    <w:name w:val="Heading"/>
+    <w:basedOn w:val="Normal"/>
+    <w:next w:val="BodyText"/>
+    <w:qFormat/>
+    <w:pPr>
+      <w:keepNext/>
+      <w:spacing w:before="240" w:after="120"/>
+    </w:pPr>
+    <w:rPr>
+      <w:rFonts w:ascii="Liberation Sans" w:eastAsia="Source Han Sans CN" w:hAnsi="Liberation Sans" w:cs="Droid Sans Devanagari"/>
+      <w:sz w:val="28"/>
+      <w:szCs w:val="28"/>
+    </w:rPr>
+  </w:style>
+  <w:style w:type="paragraph" w:styleId="BodyText">
+    <w:name w:val="Body Text"/>
+    <w:basedOn w:val="Normal"/>
+    <w:pPr>
+      <w:spacing w:after="140" w:line="276" w:lineRule="auto"/>
+    </w:pPr>
+  </w:style>
+  <w:style w:type="paragraph" w:styleId="List">
+    <w:name w:val="List"/>
+    <w:basedOn w:val="BodyText"/>
+    <w:rPr>
+      <w:rFonts w:cs="Droid Sans Devanagari"/>
+    </w:rPr>
+  </w:style>
+  <w:style w:type="paragraph" w:styleId="Caption">
+    <w:name w:val="caption"/>
+    <w:basedOn w:val="Normal"/>
+    <w:qFormat/>
+    <w:pPr>
+      <w:suppressLineNumbers/>
+      <w:spacing w:before="120" w:after="120"/>
+    </w:pPr>
+    <w:rPr>
+      <w:rFonts w:cs="Droid Sans Devanagari"/>
+      <w:i/>
+      <w:iCs/>
+      <w:sz w:val="24"/>
+      <w:szCs w:val="24"/>
+    </w:rPr>
+  </w:style>
+  <w:style w:type="paragraph" w:customStyle="1" w:styleId="Index">
+    <w:name w:val="Index"/>
+    <w:basedOn w:val="Normal"/>
+    <w:qFormat/>
+    <w:pPr>
+      <w:suppressLineNumbers/>
+    </w:pPr>
+    <w:rPr>
+      <w:rFonts w:cs="Droid Sans Devanagari"/>
+    </w:rPr>
+  </w:style>
+  <w:style w:type="paragraph" w:styleId="Title">
+    <w:name w:val="Title"/>
+    <w:basedOn w:val="Normal"/>
+    <w:next w:val="Normal"/>
+    <w:link w:val="TitleChar"/>
+    <w:uiPriority w:val="10"/>
+    <w:qFormat/>
+    <w:rsid w:val="004D7062"/>
+    <w:pPr>
+      <w:spacing w:after="0" w:line="240" w:lineRule="auto"/>
+      <w:contextualSpacing/>
+    </w:pPr>
+    <w:rPr>
+      <w:rFonts w:asciiTheme="majorHAnsi" w:eastAsiaTheme="majorEastAsia" w:hAnsiTheme="majorHAnsi" w:cstheme="majorBidi"/>
+      <w:spacing w:val="-10"/>
+      <w:kern w:val="2"/>
+      <w:sz w:val="56"/>
+      <w:szCs w:val="56"/>
+    </w:rPr>
   </w:style>
 </w:styles>
 </file>

</xml_diff>